<commit_message>
Update laboratory reports using official Quarto template
</commit_message>
<xml_diff>
--- a/lab10/report.docx
+++ b/lab10/report.docx
@@ -2,13 +2,93 @@
 <file path=word/document.xml><?xml version="1.0" encoding="utf-8"?>
 <w:document xmlns:w="http://schemas.openxmlformats.org/wordprocessingml/2006/main" xmlns:m="http://schemas.openxmlformats.org/officeDocument/2006/math" xmlns:r="http://schemas.openxmlformats.org/officeDocument/2006/relationships" xmlns:o="urn:schemas-microsoft-com:office:office" xmlns:v="urn:schemas-microsoft-com:vml" xmlns:w10="urn:schemas-microsoft-com:office:word" xmlns:a="http://schemas.openxmlformats.org/drawingml/2006/main" xmlns:pic="http://schemas.openxmlformats.org/drawingml/2006/picture" xmlns:wp="http://schemas.openxmlformats.org/drawingml/2006/wordprocessingDrawing">
   <w:body>
+    <w:p>
+      <w:pPr>
+        <w:pStyle w:val="Title"/>
+      </w:pPr>
+      <w:r>
+        <w:t xml:space="preserve">Лабораторная работа № 10</w:t>
+      </w:r>
+    </w:p>
+    <w:p>
+      <w:pPr>
+        <w:pStyle w:val="Subtitle"/>
+      </w:pPr>
+      <w:r>
+        <w:t xml:space="preserve">Операционные системы — НПИбд-01-25</w:t>
+      </w:r>
+    </w:p>
+    <w:p>
+      <w:pPr>
+        <w:pStyle w:val="Author"/>
+      </w:pPr>
+      <w:r>
+        <w:t xml:space="preserve">Взваров Михаил</w:t>
+      </w:r>
+    </w:p>
+    <w:p>
+      <w:pPr>
+        <w:pStyle w:val="AbstractTitle"/>
+      </w:pPr>
+      <w:r>
+        <w:t xml:space="preserve">Аннотация</w:t>
+      </w:r>
+    </w:p>
+    <w:p>
+      <w:pPr>
+        <w:pStyle w:val="Abstract"/>
+      </w:pPr>
+      <w:r>
+        <w:t xml:space="preserve">В отчёте представлены результаты выполнения лабораторной работы № 10</w:t>
+      </w:r>
+      <w:r>
+        <w:t xml:space="preserve"> </w:t>
+      </w:r>
+      <w:r>
+        <w:t xml:space="preserve">по дисциплине «Операционные системы».</w:t>
+      </w:r>
+    </w:p>
+    <w:p>
+      <w:pPr>
+        <w:pStyle w:val="Abstract"/>
+      </w:pPr>
+      <w:r>
+        <w:t xml:space="preserve">Приведены ход выполнения работы, полученные результаты и выводы.</w:t>
+      </w:r>
+    </w:p>
+    <w:sdt>
+      <w:sdtPr>
+        <w:docPartObj>
+          <w:docPartGallery w:val="Table of Contents"/>
+          <w:docPartUnique/>
+        </w:docPartObj>
+      </w:sdtPr>
+      <w:sdtContent>
+        <w:p>
+          <w:pPr>
+            <w:pStyle w:val="TOCHeading"/>
+          </w:pPr>
+          <w:r>
+            <w:t xml:space="preserve">Содержание</w:t>
+          </w:r>
+        </w:p>
+        <w:p>
+          <w:r>
+            <w:fldChar w:fldCharType="begin" w:dirty="true"/>
+            <w:instrText xml:space="preserve">TOC \o "1-2" \h \z \u</w:instrText>
+            <w:fldChar w:fldCharType="separate"/>
+            <w:fldChar w:fldCharType="end"/>
+          </w:r>
+        </w:p>
+      </w:sdtContent>
+    </w:sdt>
     <w:bookmarkStart w:id="43" w:name="лабораторная-работа-10"/>
     <w:p>
       <w:pPr>
         <w:pStyle w:val="Heading1"/>
       </w:pPr>
       <w:r>
-        <w:t xml:space="preserve">Лабораторная работа № 10</w:t>
+        <w:t xml:space="preserve">1. Лабораторная работа № 10</w:t>
       </w:r>
     </w:p>
     <w:bookmarkStart w:id="9" w:name="текстовой-редактор-vi"/>
@@ -17,7 +97,7 @@
         <w:pStyle w:val="Heading2"/>
       </w:pPr>
       <w:r>
-        <w:t xml:space="preserve">Текстовой редактор vi</w:t>
+        <w:t xml:space="preserve">1.1 Текстовой редактор vi</w:t>
       </w:r>
     </w:p>
     <w:p>
@@ -84,7 +164,7 @@
         <w:pStyle w:val="Heading2"/>
       </w:pPr>
       <w:r>
-        <w:t xml:space="preserve">Цель работы</w:t>
+        <w:t xml:space="preserve">1.2 Цель работы</w:t>
       </w:r>
     </w:p>
     <w:p>
@@ -102,7 +182,7 @@
         <w:pStyle w:val="Heading2"/>
       </w:pPr>
       <w:r>
-        <w:t xml:space="preserve">Задание</w:t>
+        <w:t xml:space="preserve">1.3 Задание</w:t>
       </w:r>
     </w:p>
     <w:p>
@@ -264,7 +344,7 @@
         <w:pStyle w:val="Heading2"/>
       </w:pPr>
       <w:r>
-        <w:t xml:space="preserve">Теоретические сведения</w:t>
+        <w:t xml:space="preserve">1.4 Теоретические сведения</w:t>
       </w:r>
     </w:p>
     <w:p>
@@ -473,7 +553,7 @@
         <w:pStyle w:val="Heading2"/>
       </w:pPr>
       <w:r>
-        <w:t xml:space="preserve">Выполнение лабораторной работы</w:t>
+        <w:t xml:space="preserve">1.5 Выполнение лабораторной работы</w:t>
       </w:r>
     </w:p>
     <w:bookmarkStart w:id="16" w:name="переход-в-рабочий-каталог"/>
@@ -482,7 +562,7 @@
         <w:pStyle w:val="Heading3"/>
       </w:pPr>
       <w:r>
-        <w:t xml:space="preserve">1. Переход в рабочий каталог</w:t>
+        <w:t xml:space="preserve">1.5.1 1. Переход в рабочий каталог</w:t>
       </w:r>
     </w:p>
     <w:p>
@@ -563,7 +643,7 @@
               <a:graphicData uri="http://schemas.openxmlformats.org/drawingml/2006/picture">
                 <pic:pic>
                   <pic:nvPicPr>
-                    <pic:cNvPr descr="images/Вставленное%20изображение.png" id="15" name="Picture"/>
+                    <pic:cNvPr descr="image/Вставленное%20изображение.png" id="15" name="Picture"/>
                     <pic:cNvPicPr>
                       <a:picLocks noChangeArrowheads="1" noChangeAspect="1"/>
                     </pic:cNvPicPr>
@@ -611,7 +691,7 @@
         <w:pStyle w:val="Heading3"/>
       </w:pPr>
       <w:r>
-        <w:t xml:space="preserve">2. Просмотр содержимого файла hello.sh</w:t>
+        <w:t xml:space="preserve">1.5.2 2. Просмотр содержимого файла hello.sh</w:t>
       </w:r>
     </w:p>
     <w:p>
@@ -655,7 +735,7 @@
               <a:graphicData uri="http://schemas.openxmlformats.org/drawingml/2006/picture">
                 <pic:pic>
                   <pic:nvPicPr>
-                    <pic:cNvPr descr="images/Вставленное%20изображение%20(2).png" id="19" name="Picture"/>
+                    <pic:cNvPr descr="image/Вставленное%20изображение%20(2).png" id="19" name="Picture"/>
                     <pic:cNvPicPr>
                       <a:picLocks noChangeArrowheads="1" noChangeAspect="1"/>
                     </pic:cNvPicPr>
@@ -703,7 +783,7 @@
         <w:pStyle w:val="Heading3"/>
       </w:pPr>
       <w:r>
-        <w:t xml:space="preserve">3. Проверка прав доступа</w:t>
+        <w:t xml:space="preserve">1.5.3 3. Проверка прав доступа</w:t>
       </w:r>
     </w:p>
     <w:p>
@@ -747,7 +827,7 @@
               <a:graphicData uri="http://schemas.openxmlformats.org/drawingml/2006/picture">
                 <pic:pic>
                   <pic:nvPicPr>
-                    <pic:cNvPr descr="images/Вставленное%20изображение%20(3).png" id="23" name="Picture"/>
+                    <pic:cNvPr descr="image/Вставленное%20изображение%20(3).png" id="23" name="Picture"/>
                     <pic:cNvPicPr>
                       <a:picLocks noChangeArrowheads="1" noChangeAspect="1"/>
                     </pic:cNvPicPr>
@@ -795,7 +875,7 @@
         <w:pStyle w:val="Heading3"/>
       </w:pPr>
       <w:r>
-        <w:t xml:space="preserve">4. Работа с файлом в редакторе vi</w:t>
+        <w:t xml:space="preserve">1.5.4 4. Работа с файлом в редакторе vi</w:t>
       </w:r>
     </w:p>
     <w:p>
@@ -858,7 +938,7 @@
               <a:graphicData uri="http://schemas.openxmlformats.org/drawingml/2006/picture">
                 <pic:pic>
                   <pic:nvPicPr>
-                    <pic:cNvPr descr="images/Вставленное%20изображение%20(4).png" id="27" name="Picture"/>
+                    <pic:cNvPr descr="image/Вставленное%20изображение%20(4).png" id="27" name="Picture"/>
                     <pic:cNvPicPr>
                       <a:picLocks noChangeArrowheads="1" noChangeAspect="1"/>
                     </pic:cNvPicPr>
@@ -906,7 +986,7 @@
         <w:pStyle w:val="Heading3"/>
       </w:pPr>
       <w:r>
-        <w:t xml:space="preserve">5. Редактирование сценария</w:t>
+        <w:t xml:space="preserve">1.5.5 5. Редактирование сценария</w:t>
       </w:r>
     </w:p>
     <w:p>
@@ -1094,7 +1174,7 @@
               <a:graphicData uri="http://schemas.openxmlformats.org/drawingml/2006/picture">
                 <pic:pic>
                   <pic:nvPicPr>
-                    <pic:cNvPr descr="images/Вставленное%20изображение%20(5).png" id="31" name="Picture"/>
+                    <pic:cNvPr descr="image/Вставленное%20изображение%20(5).png" id="31" name="Picture"/>
                     <pic:cNvPicPr>
                       <a:picLocks noChangeArrowheads="1" noChangeAspect="1"/>
                     </pic:cNvPicPr>
@@ -1142,7 +1222,7 @@
         <w:pStyle w:val="Heading3"/>
       </w:pPr>
       <w:r>
-        <w:t xml:space="preserve">6. Запуск сценария</w:t>
+        <w:t xml:space="preserve">1.5.6 6. Запуск сценария</w:t>
       </w:r>
     </w:p>
     <w:p>
@@ -1223,7 +1303,7 @@
               <a:graphicData uri="http://schemas.openxmlformats.org/drawingml/2006/picture">
                 <pic:pic>
                   <pic:nvPicPr>
-                    <pic:cNvPr descr="images/Вставленное%20изображение%20(6).png" id="35" name="Picture"/>
+                    <pic:cNvPr descr="image/Вставленное%20изображение%20(6).png" id="35" name="Picture"/>
                     <pic:cNvPicPr>
                       <a:picLocks noChangeArrowheads="1" noChangeAspect="1"/>
                     </pic:cNvPicPr>
@@ -1271,7 +1351,7 @@
         <w:pStyle w:val="Heading3"/>
       </w:pPr>
       <w:r>
-        <w:t xml:space="preserve">7. Итоговая проверка</w:t>
+        <w:t xml:space="preserve">1.5.7 7. Итоговая проверка</w:t>
       </w:r>
     </w:p>
     <w:p>
@@ -1296,7 +1376,7 @@
               <a:graphicData uri="http://schemas.openxmlformats.org/drawingml/2006/picture">
                 <pic:pic>
                   <pic:nvPicPr>
-                    <pic:cNvPr descr="images/Вставленное%20изображение%20(7).png" id="39" name="Picture"/>
+                    <pic:cNvPr descr="image/Вставленное%20изображение%20(7).png" id="39" name="Picture"/>
                     <pic:cNvPicPr>
                       <a:picLocks noChangeArrowheads="1" noChangeAspect="1"/>
                     </pic:cNvPicPr>
@@ -1345,7 +1425,7 @@
         <w:pStyle w:val="Heading2"/>
       </w:pPr>
       <w:r>
-        <w:t xml:space="preserve">Вывод</w:t>
+        <w:t xml:space="preserve">1.6 Вывод</w:t>
       </w:r>
     </w:p>
     <w:p>
@@ -1372,7 +1452,7 @@
         <w:pStyle w:val="Heading1"/>
       </w:pPr>
       <w:r>
-        <w:t xml:space="preserve">Контрольные вопросы</w:t>
+        <w:t xml:space="preserve">2. Контрольные вопросы</w:t>
       </w:r>
     </w:p>
     <w:bookmarkStart w:id="44" w:name="какие-режимы-работы-существуют-в-vi"/>
@@ -1381,7 +1461,7 @@
         <w:pStyle w:val="Heading2"/>
       </w:pPr>
       <w:r>
-        <w:t xml:space="preserve">1. Какие режимы работы существуют в vi?</w:t>
+        <w:t xml:space="preserve">2.1 1. Какие режимы работы существуют в vi?</w:t>
       </w:r>
     </w:p>
     <w:p>
@@ -1399,7 +1479,7 @@
         <w:pStyle w:val="Heading2"/>
       </w:pPr>
       <w:r>
-        <w:t xml:space="preserve">2. Как выйти из редактора без сохранения изменений?</w:t>
+        <w:t xml:space="preserve">2.2 2. Как выйти из редактора без сохранения изменений?</w:t>
       </w:r>
     </w:p>
     <w:p>
@@ -1436,7 +1516,7 @@
         <w:pStyle w:val="Heading2"/>
       </w:pPr>
       <w:r>
-        <w:t xml:space="preserve">3. Какие команды используются для позиционирования курсора?</w:t>
+        <w:t xml:space="preserve">2.3 3. Какие команды используются для позиционирования курсора?</w:t>
       </w:r>
     </w:p>
     <w:p>
@@ -1454,7 +1534,7 @@
         <w:pStyle w:val="Heading2"/>
       </w:pPr>
       <w:r>
-        <w:t xml:space="preserve">4. Что в редакторе vi считается словом?</w:t>
+        <w:t xml:space="preserve">2.4 4. Что в редакторе vi считается словом?</w:t>
       </w:r>
     </w:p>
     <w:p>
@@ -1472,7 +1552,7 @@
         <w:pStyle w:val="Heading2"/>
       </w:pPr>
       <w:r>
-        <w:t xml:space="preserve">5. Как перейти в начало и конец файла?</w:t>
+        <w:t xml:space="preserve">2.5 5. Как перейти в начало и конец файла?</w:t>
       </w:r>
     </w:p>
     <w:p>
@@ -1520,7 +1600,7 @@
         <w:pStyle w:val="Heading2"/>
       </w:pPr>
       <w:r>
-        <w:t xml:space="preserve">6. На какие группы можно разделить команды редактирования vi?</w:t>
+        <w:t xml:space="preserve">2.6 6. На какие группы можно разделить команды редактирования vi?</w:t>
       </w:r>
     </w:p>
     <w:p>
@@ -1538,7 +1618,7 @@
         <w:pStyle w:val="Heading2"/>
       </w:pPr>
       <w:r>
-        <w:t xml:space="preserve">7. Как заполнить строку символами $?</w:t>
+        <w:t xml:space="preserve">2.7 7. Как заполнить строку символами $?</w:t>
       </w:r>
     </w:p>
     <w:p>
@@ -1556,7 +1636,7 @@
         <w:pStyle w:val="Heading2"/>
       </w:pPr>
       <w:r>
-        <w:t xml:space="preserve">8. Как отменить последнее действие?</w:t>
+        <w:t xml:space="preserve">2.8 8. Как отменить последнее действие?</w:t>
       </w:r>
     </w:p>
     <w:p>
@@ -1585,7 +1665,7 @@
         <w:pStyle w:val="Heading2"/>
       </w:pPr>
       <w:r>
-        <w:t xml:space="preserve">9. Какие команды выполняются в режиме последней строки?</w:t>
+        <w:t xml:space="preserve">2.9 9. Какие команды выполняются в режиме последней строки?</w:t>
       </w:r>
     </w:p>
     <w:p>
@@ -1711,7 +1791,7 @@
         <w:pStyle w:val="Heading2"/>
       </w:pPr>
       <w:r>
-        <w:t xml:space="preserve">10. Как определить положение конца строки, не перемещая курсор?</w:t>
+        <w:t xml:space="preserve">2.10 10. Как определить положение конца строки, не перемещая курсор?</w:t>
       </w:r>
     </w:p>
     <w:p>
@@ -1748,7 +1828,7 @@
         <w:pStyle w:val="Heading2"/>
       </w:pPr>
       <w:r>
-        <w:t xml:space="preserve">11. Какие параметры редактора vi можно изменять?</w:t>
+        <w:t xml:space="preserve">2.11 11. Какие параметры редактора vi можно изменять?</w:t>
       </w:r>
     </w:p>
     <w:p>
@@ -1859,7 +1939,7 @@
         <w:pStyle w:val="Heading2"/>
       </w:pPr>
       <w:r>
-        <w:t xml:space="preserve">12. Как определить, в каком режиме находится редактор vi?</w:t>
+        <w:t xml:space="preserve">2.12 12. Как определить, в каком режиме находится редактор vi?</w:t>
       </w:r>
     </w:p>
     <w:p>
@@ -1877,7 +1957,7 @@
         <w:pStyle w:val="Heading2"/>
       </w:pPr>
       <w:r>
-        <w:t xml:space="preserve">13. Изобразите взаимосвязь режимов работы vi.</w:t>
+        <w:t xml:space="preserve">2.13 13. Изобразите взаимосвязь режимов работы vi.</w:t>
       </w:r>
     </w:p>
     <w:p>
@@ -2132,7 +2212,7 @@
         <w:pStyle w:val="Heading1"/>
       </w:pPr>
       <w:r>
-        <w:t xml:space="preserve">Библиография</w:t>
+        <w:t xml:space="preserve">3. Библиография</w:t>
       </w:r>
     </w:p>
     <w:p>
@@ -2565,10 +2645,10 @@
   <w:docDefaults>
     <w:rPrDefault>
       <w:rPr>
-        <w:rFonts w:asciiTheme="minorHAnsi" w:cstheme="minorBidi" w:eastAsiaTheme="minorHAnsi" w:hAnsiTheme="minorHAnsi"/>
+        <w:rFonts w:asciiTheme="minorHAnsi" w:cstheme="minorBidi" w:eastAsiaTheme="minorEastAsia" w:hAnsiTheme="minorHAnsi"/>
         <w:sz w:val="24"/>
         <w:szCs w:val="24"/>
-        <w:lang w:bidi="ar-SA" w:eastAsia="en-US" w:val="en-US"/>
+        <w:lang w:bidi="ar-SA" w:eastAsia="zh-CN" w:val="ru-RU"/>
       </w:rPr>
     </w:rPrDefault>
     <w:pPrDefault>
@@ -3109,13 +3189,6 @@
       </w:tblCellMar>
     </w:tblPr>
     <w:tblStylePr w:type="firstRow">
-      <w:tblPr>
-        <w:jc w:val="left"/>
-        <w:tblInd w:type="dxa" w:w="0"/>
-      </w:tblPr>
-      <w:trPr>
-        <w:jc w:val="left"/>
-      </w:trPr>
       <w:tcPr>
         <w:tcBorders>
           <w:bottom w:val="single"/>
@@ -3229,6 +3302,7 @@
     <w:link w:val="VerbatimChar"/>
     <w:pPr>
       <w:wordWrap w:val="off"/>
+      <w:shd w:val="clear" w:fill="f1f3f5"/>
     </w:pPr>
   </w:style>
   <w:style w:type="character" w:customStyle="1" w:styleId="KeywordTok">
@@ -3236,93 +3310,104 @@
     <w:basedOn w:val="VerbatimChar"/>
     <w:rPr>
       <w:b/>
-      <w:color w:val="007020"/>
+      <w:color w:val="003b4f"/>
+      <w:shd w:val="clear" w:fill="f1f3f5"/>
     </w:rPr>
   </w:style>
   <w:style w:type="character" w:customStyle="1" w:styleId="DataTypeTok">
     <w:name w:val="DataTypeTok"/>
     <w:basedOn w:val="VerbatimChar"/>
     <w:rPr>
-      <w:color w:val="902000"/>
+      <w:color w:val="ad0000"/>
+      <w:shd w:val="clear" w:fill="f1f3f5"/>
     </w:rPr>
   </w:style>
   <w:style w:type="character" w:customStyle="1" w:styleId="DecValTok">
     <w:name w:val="DecValTok"/>
     <w:basedOn w:val="VerbatimChar"/>
     <w:rPr>
-      <w:color w:val="40a070"/>
+      <w:color w:val="ad0000"/>
+      <w:shd w:val="clear" w:fill="f1f3f5"/>
     </w:rPr>
   </w:style>
   <w:style w:type="character" w:customStyle="1" w:styleId="BaseNTok">
     <w:name w:val="BaseNTok"/>
     <w:basedOn w:val="VerbatimChar"/>
     <w:rPr>
-      <w:color w:val="40a070"/>
+      <w:color w:val="ad0000"/>
+      <w:shd w:val="clear" w:fill="f1f3f5"/>
     </w:rPr>
   </w:style>
   <w:style w:type="character" w:customStyle="1" w:styleId="FloatTok">
     <w:name w:val="FloatTok"/>
     <w:basedOn w:val="VerbatimChar"/>
     <w:rPr>
-      <w:color w:val="40a070"/>
+      <w:color w:val="ad0000"/>
+      <w:shd w:val="clear" w:fill="f1f3f5"/>
     </w:rPr>
   </w:style>
   <w:style w:type="character" w:customStyle="1" w:styleId="ConstantTok">
     <w:name w:val="ConstantTok"/>
     <w:basedOn w:val="VerbatimChar"/>
     <w:rPr>
-      <w:color w:val="880000"/>
+      <w:color w:val="8f5902"/>
+      <w:shd w:val="clear" w:fill="f1f3f5"/>
     </w:rPr>
   </w:style>
   <w:style w:type="character" w:customStyle="1" w:styleId="CharTok">
     <w:name w:val="CharTok"/>
     <w:basedOn w:val="VerbatimChar"/>
     <w:rPr>
-      <w:color w:val="4070a0"/>
+      <w:color w:val="20794d"/>
+      <w:shd w:val="clear" w:fill="f1f3f5"/>
     </w:rPr>
   </w:style>
   <w:style w:type="character" w:customStyle="1" w:styleId="SpecialCharTok">
     <w:name w:val="SpecialCharTok"/>
     <w:basedOn w:val="VerbatimChar"/>
     <w:rPr>
-      <w:color w:val="4070a0"/>
+      <w:color w:val="5e5e5e"/>
+      <w:shd w:val="clear" w:fill="f1f3f5"/>
     </w:rPr>
   </w:style>
   <w:style w:type="character" w:customStyle="1" w:styleId="StringTok">
     <w:name w:val="StringTok"/>
     <w:basedOn w:val="VerbatimChar"/>
     <w:rPr>
-      <w:color w:val="4070a0"/>
+      <w:color w:val="20794d"/>
+      <w:shd w:val="clear" w:fill="f1f3f5"/>
     </w:rPr>
   </w:style>
   <w:style w:type="character" w:customStyle="1" w:styleId="VerbatimStringTok">
     <w:name w:val="VerbatimStringTok"/>
     <w:basedOn w:val="VerbatimChar"/>
     <w:rPr>
-      <w:color w:val="4070a0"/>
+      <w:color w:val="20794d"/>
+      <w:shd w:val="clear" w:fill="f1f3f5"/>
     </w:rPr>
   </w:style>
   <w:style w:type="character" w:customStyle="1" w:styleId="SpecialStringTok">
     <w:name w:val="SpecialStringTok"/>
     <w:basedOn w:val="VerbatimChar"/>
     <w:rPr>
-      <w:color w:val="bb6688"/>
+      <w:color w:val="20794d"/>
+      <w:shd w:val="clear" w:fill="f1f3f5"/>
     </w:rPr>
   </w:style>
   <w:style w:type="character" w:customStyle="1" w:styleId="ImportTok">
     <w:name w:val="ImportTok"/>
     <w:basedOn w:val="VerbatimChar"/>
     <w:rPr>
-      <w:b/>
-      <w:color w:val="008000"/>
+      <w:color w:val="00769e"/>
+      <w:shd w:val="clear" w:fill="f1f3f5"/>
     </w:rPr>
   </w:style>
   <w:style w:type="character" w:customStyle="1" w:styleId="CommentTok">
     <w:name w:val="CommentTok"/>
     <w:basedOn w:val="VerbatimChar"/>
     <w:rPr>
-      <w:i/>
-      <w:color w:val="60a0b0"/>
+      <w:color w:val="5e5e5e"/>
+      <w:shd w:val="clear" w:fill="f1f3f5"/>
     </w:rPr>
   </w:style>
   <w:style w:type="character" w:customStyle="1" w:styleId="DocumentationTok">
@@ -3330,46 +3415,49 @@
     <w:basedOn w:val="VerbatimChar"/>
     <w:rPr>
       <w:i/>
-      <w:color w:val="ba2121"/>
+      <w:color w:val="5e5e5e"/>
+      <w:shd w:val="clear" w:fill="f1f3f5"/>
     </w:rPr>
   </w:style>
   <w:style w:type="character" w:customStyle="1" w:styleId="AnnotationTok">
     <w:name w:val="AnnotationTok"/>
     <w:basedOn w:val="VerbatimChar"/>
     <w:rPr>
-      <w:b/>
-      <w:i/>
-      <w:color w:val="60a0b0"/>
+      <w:color w:val="5e5e5e"/>
+      <w:shd w:val="clear" w:fill="f1f3f5"/>
     </w:rPr>
   </w:style>
   <w:style w:type="character" w:customStyle="1" w:styleId="CommentVarTok">
     <w:name w:val="CommentVarTok"/>
     <w:basedOn w:val="VerbatimChar"/>
     <w:rPr>
-      <w:b/>
       <w:i/>
-      <w:color w:val="60a0b0"/>
+      <w:color w:val="5e5e5e"/>
+      <w:shd w:val="clear" w:fill="f1f3f5"/>
     </w:rPr>
   </w:style>
   <w:style w:type="character" w:customStyle="1" w:styleId="OtherTok">
     <w:name w:val="OtherTok"/>
     <w:basedOn w:val="VerbatimChar"/>
     <w:rPr>
-      <w:color w:val="007020"/>
+      <w:color w:val="003b4f"/>
+      <w:shd w:val="clear" w:fill="f1f3f5"/>
     </w:rPr>
   </w:style>
   <w:style w:type="character" w:customStyle="1" w:styleId="FunctionTok">
     <w:name w:val="FunctionTok"/>
     <w:basedOn w:val="VerbatimChar"/>
     <w:rPr>
-      <w:color w:val="06287e"/>
+      <w:color w:val="4758ab"/>
+      <w:shd w:val="clear" w:fill="f1f3f5"/>
     </w:rPr>
   </w:style>
   <w:style w:type="character" w:customStyle="1" w:styleId="VariableTok">
     <w:name w:val="VariableTok"/>
     <w:basedOn w:val="VerbatimChar"/>
     <w:rPr>
-      <w:color w:val="19177c"/>
+      <w:color w:val="111111"/>
+      <w:shd w:val="clear" w:fill="f1f3f5"/>
     </w:rPr>
   </w:style>
   <w:style w:type="character" w:customStyle="1" w:styleId="ControlFlowTok">
@@ -3377,85 +3465,98 @@
     <w:basedOn w:val="VerbatimChar"/>
     <w:rPr>
       <w:b/>
-      <w:color w:val="007020"/>
+      <w:color w:val="003b4f"/>
+      <w:shd w:val="clear" w:fill="f1f3f5"/>
     </w:rPr>
   </w:style>
   <w:style w:type="character" w:customStyle="1" w:styleId="OperatorTok">
     <w:name w:val="OperatorTok"/>
     <w:basedOn w:val="VerbatimChar"/>
     <w:rPr>
-      <w:color w:val="666666"/>
+      <w:color w:val="5e5e5e"/>
+      <w:shd w:val="clear" w:fill="f1f3f5"/>
     </w:rPr>
   </w:style>
   <w:style w:type="character" w:customStyle="1" w:styleId="BuiltInTok">
     <w:name w:val="BuiltInTok"/>
     <w:basedOn w:val="VerbatimChar"/>
     <w:rPr>
-      <w:color w:val="008000"/>
+      <w:color w:val="003b4f"/>
+      <w:shd w:val="clear" w:fill="f1f3f5"/>
     </w:rPr>
   </w:style>
   <w:style w:type="character" w:customStyle="1" w:styleId="ExtensionTok">
     <w:name w:val="ExtensionTok"/>
     <w:basedOn w:val="VerbatimChar"/>
-    <w:rPr/>
+    <w:rPr>
+      <w:color w:val="003b4f"/>
+      <w:shd w:val="clear" w:fill="f1f3f5"/>
+    </w:rPr>
   </w:style>
   <w:style w:type="character" w:customStyle="1" w:styleId="PreprocessorTok">
     <w:name w:val="PreprocessorTok"/>
     <w:basedOn w:val="VerbatimChar"/>
     <w:rPr>
-      <w:color w:val="bc7a00"/>
+      <w:color w:val="ad0000"/>
+      <w:shd w:val="clear" w:fill="f1f3f5"/>
     </w:rPr>
   </w:style>
   <w:style w:type="character" w:customStyle="1" w:styleId="AttributeTok">
     <w:name w:val="AttributeTok"/>
     <w:basedOn w:val="VerbatimChar"/>
     <w:rPr>
-      <w:color w:val="7d9029"/>
+      <w:color w:val="657422"/>
+      <w:shd w:val="clear" w:fill="f1f3f5"/>
     </w:rPr>
   </w:style>
   <w:style w:type="character" w:customStyle="1" w:styleId="RegionMarkerTok">
     <w:name w:val="RegionMarkerTok"/>
     <w:basedOn w:val="VerbatimChar"/>
-    <w:rPr/>
+    <w:rPr>
+      <w:color w:val="003b4f"/>
+      <w:shd w:val="clear" w:fill="f1f3f5"/>
+    </w:rPr>
   </w:style>
   <w:style w:type="character" w:customStyle="1" w:styleId="InformationTok">
     <w:name w:val="InformationTok"/>
     <w:basedOn w:val="VerbatimChar"/>
     <w:rPr>
-      <w:b/>
-      <w:i/>
-      <w:color w:val="60a0b0"/>
+      <w:color w:val="5e5e5e"/>
+      <w:shd w:val="clear" w:fill="f1f3f5"/>
     </w:rPr>
   </w:style>
   <w:style w:type="character" w:customStyle="1" w:styleId="WarningTok">
     <w:name w:val="WarningTok"/>
     <w:basedOn w:val="VerbatimChar"/>
     <w:rPr>
-      <w:b/>
       <w:i/>
-      <w:color w:val="60a0b0"/>
+      <w:color w:val="5e5e5e"/>
+      <w:shd w:val="clear" w:fill="f1f3f5"/>
     </w:rPr>
   </w:style>
   <w:style w:type="character" w:customStyle="1" w:styleId="AlertTok">
     <w:name w:val="AlertTok"/>
     <w:basedOn w:val="VerbatimChar"/>
     <w:rPr>
-      <w:b/>
-      <w:color w:val="ff0000"/>
+      <w:color w:val="ad0000"/>
+      <w:shd w:val="clear" w:fill="f1f3f5"/>
     </w:rPr>
   </w:style>
   <w:style w:type="character" w:customStyle="1" w:styleId="ErrorTok">
     <w:name w:val="ErrorTok"/>
     <w:basedOn w:val="VerbatimChar"/>
     <w:rPr>
-      <w:b/>
-      <w:color w:val="ff0000"/>
+      <w:color w:val="ad0000"/>
+      <w:shd w:val="clear" w:fill="f1f3f5"/>
     </w:rPr>
   </w:style>
   <w:style w:type="character" w:customStyle="1" w:styleId="NormalTok">
     <w:name w:val="NormalTok"/>
     <w:basedOn w:val="VerbatimChar"/>
-    <w:rPr/>
+    <w:rPr>
+      <w:color w:val="003b4f"/>
+      <w:shd w:val="clear" w:fill="f1f3f5"/>
+    </w:rPr>
   </w:style>
 </w:styles>
 </file>

</xml_diff>